<commit_message>
UI: Rename app to 'Live大村市消防団' and update version to v1.3.0
</commit_message>
<xml_diff>
--- a/システム解説書.docx
+++ b/システム解説書.docx
@@ -11,21 +11,39 @@
       </w:pPr>
       <w:r>
         <w:rPr>
-          <w:b/>
-          <w:bCs/>
-        </w:rPr>
-        <w:t>災害報告アプリ：システム解説書（初心者向け）</w:t>
-      </w:r>
-    </w:p>
-    <w:p>
-      <w:r>
-        <w:t>この解説書は、プログラミングの知識がない方でも「自分のアプリがどうやって動いているのか」を理解できるように作成されました。専門用語はできるだけ日常的な言葉に置き換えて説明しています。</w:t>
-      </w:r>
-    </w:p>
-    <w:p>
-      <w:r>
-        <w:pict w14:anchorId="2E89C364">
-          <v:rect id="_x0000_i1073" style="width:532.8pt;height:.75pt" o:hrpct="0" o:hralign="center" o:hrstd="t" o:hr="t" fillcolor="#a0a0a0" stroked="f">
+          <w:rFonts w:ascii="Segoe UI Emoji" w:hAnsi="Segoe UI Emoji" w:cs="Segoe UI Emoji"/>
+          <w:b/>
+          <w:bCs/>
+        </w:rPr>
+        <w:t>🚒</w:t>
+      </w:r>
+      <w:r>
+        <w:rPr>
+          <w:b/>
+          <w:bCs/>
+        </w:rPr>
+        <w:t xml:space="preserve"> 災害報告アプリ システム構成の解説（初心者向け）</w:t>
+      </w:r>
+    </w:p>
+    <w:p>
+      <w:r>
+        <w:t>このアプリは、これまでより**「圧倒的に速く」「災害時でも絶対に止まらない」</w:t>
+      </w:r>
+      <w:r>
+        <w:rPr>
+          <w:b/>
+          <w:bCs/>
+        </w:rPr>
+        <w:t>ことを目的に、システムの心臓部を丸ごと入れ替えました。 ここでは、以前の仕組み（旧システム）と現在の仕組み（新システム）を身近なものに例えて、</w:t>
+      </w:r>
+      <w:r>
+        <w:t>「なぜ凄くなったのか」**を分かりやすく解説します。</w:t>
+      </w:r>
+    </w:p>
+    <w:p>
+      <w:r>
+        <w:pict w14:anchorId="7FAD951B">
+          <v:rect id="_x0000_i1065" style="width:532.8pt;height:.75pt" o:hrpct="0" o:hralign="center" o:hrstd="t" o:hr="t" fillcolor="#a0a0a0" stroked="f">
             <v:textbox inset="5.85pt,.7pt,5.85pt,.7pt"/>
           </v:rect>
         </w:pict>
@@ -40,32 +58,30 @@
       </w:pPr>
       <w:r>
         <w:rPr>
-          <w:b/>
-          <w:bCs/>
-        </w:rPr>
-        <w:t>1. 全体の仕組み：3つの役割</w:t>
-      </w:r>
-    </w:p>
-    <w:p>
-      <w:r>
-        <w:t>このアプリは、大きく分けて </w:t>
-      </w:r>
-      <w:r>
-        <w:rPr>
-          <w:b/>
-          <w:bCs/>
-        </w:rPr>
-        <w:t>「3つの場所」</w:t>
-      </w:r>
-      <w:r>
-        <w:t> で動いています。</w:t>
+          <w:rFonts w:ascii="Segoe UI Emoji" w:hAnsi="Segoe UI Emoji" w:cs="Segoe UI Emoji"/>
+          <w:b/>
+          <w:bCs/>
+        </w:rPr>
+        <w:t>🏛️</w:t>
+      </w:r>
+      <w:r>
+        <w:rPr>
+          <w:b/>
+          <w:bCs/>
+        </w:rPr>
+        <w:t xml:space="preserve"> アプリの基本構成（2つの役割）</w:t>
+      </w:r>
+    </w:p>
+    <w:p>
+      <w:r>
+        <w:t>どんなアプリも、大きく分けると以下の2つの役割でできています。</w:t>
       </w:r>
     </w:p>
     <w:p>
       <w:pPr>
         <w:numPr>
           <w:ilvl w:val="0"/>
-          <w:numId w:val="1"/>
+          <w:numId w:val="7"/>
         </w:numPr>
       </w:pPr>
       <w:r>
@@ -73,172 +89,50 @@
           <w:b/>
           <w:bCs/>
         </w:rPr>
-        <w:t>フロントエンド（スマホアプリ本体）</w:t>
+        <w:t>お店のショーウィンドウ（画面とプログラムの置き場所）</w:t>
       </w:r>
     </w:p>
     <w:p>
       <w:pPr>
         <w:numPr>
           <w:ilvl w:val="1"/>
-          <w:numId w:val="1"/>
+          <w:numId w:val="7"/>
         </w:numPr>
       </w:pPr>
       <w:r>
-        <w:t>皆さんのスマートフォンやブラウザで動いている「画面」そのものです。</w:t>
+        <w:t>皆さんのスマホにアプリの画面（ボタンや色など）を届ける役割です。</w:t>
+      </w:r>
+    </w:p>
+    <w:p>
+      <w:pPr>
+        <w:numPr>
+          <w:ilvl w:val="0"/>
+          <w:numId w:val="7"/>
+        </w:numPr>
+      </w:pPr>
+      <w:r>
+        <w:rPr>
+          <w:b/>
+          <w:bCs/>
+        </w:rPr>
+        <w:t>お店の倉庫（データの保存場所）</w:t>
       </w:r>
     </w:p>
     <w:p>
       <w:pPr>
         <w:numPr>
           <w:ilvl w:val="1"/>
-          <w:numId w:val="1"/>
+          <w:numId w:val="7"/>
         </w:numPr>
       </w:pPr>
       <w:r>
-        <w:t>役割：情報の入力、写真の撮影、LIVE映像の表示など。</w:t>
-      </w:r>
-    </w:p>
-    <w:p>
-      <w:pPr>
-        <w:numPr>
-          <w:ilvl w:val="1"/>
-          <w:numId w:val="1"/>
-        </w:numPr>
-      </w:pPr>
-      <w:r>
-        <w:t>例えるなら：</w:t>
-      </w:r>
-      <w:r>
-        <w:rPr>
-          <w:b/>
-          <w:bCs/>
-        </w:rPr>
-        <w:t>「お店のカウンター」</w:t>
-      </w:r>
-      <w:r>
-        <w:t> です。お客さん（ユーザー）が注文（入力）する場所です。</w:t>
-      </w:r>
-    </w:p>
-    <w:p>
-      <w:pPr>
-        <w:numPr>
-          <w:ilvl w:val="0"/>
-          <w:numId w:val="1"/>
-        </w:numPr>
-      </w:pPr>
-      <w:r>
-        <w:rPr>
-          <w:b/>
-          <w:bCs/>
-        </w:rPr>
-        <w:t>バックエンド（GAS：Google Apps Script）</w:t>
-      </w:r>
-    </w:p>
-    <w:p>
-      <w:pPr>
-        <w:numPr>
-          <w:ilvl w:val="1"/>
-          <w:numId w:val="1"/>
-        </w:numPr>
-      </w:pPr>
-      <w:r>
-        <w:t>Googleのサーバーの中で動いている「司令塔」です。</w:t>
-      </w:r>
-    </w:p>
-    <w:p>
-      <w:pPr>
-        <w:numPr>
-          <w:ilvl w:val="1"/>
-          <w:numId w:val="1"/>
-        </w:numPr>
-      </w:pPr>
-      <w:r>
-        <w:t>役割：スマホから送られてきたデータを受け取り、スプレッドシートに書き込んだり、写真として保存したりします。</w:t>
-      </w:r>
-    </w:p>
-    <w:p>
-      <w:pPr>
-        <w:numPr>
-          <w:ilvl w:val="1"/>
-          <w:numId w:val="1"/>
-        </w:numPr>
-      </w:pPr>
-      <w:r>
-        <w:t>例えるなら：</w:t>
-      </w:r>
-      <w:r>
-        <w:rPr>
-          <w:b/>
-          <w:bCs/>
-        </w:rPr>
-        <w:t>「店員さん（または調理場）」</w:t>
-      </w:r>
-      <w:r>
-        <w:t> です。カウンターからの注文を受け、帳簿に付けたり保管したりします。</w:t>
-      </w:r>
-    </w:p>
-    <w:p>
-      <w:pPr>
-        <w:numPr>
-          <w:ilvl w:val="0"/>
-          <w:numId w:val="1"/>
-        </w:numPr>
-      </w:pPr>
-      <w:r>
-        <w:rPr>
-          <w:b/>
-          <w:bCs/>
-        </w:rPr>
-        <w:t>データベース（スプレッドシート ＆ Googleドライブ）</w:t>
-      </w:r>
-    </w:p>
-    <w:p>
-      <w:pPr>
-        <w:numPr>
-          <w:ilvl w:val="1"/>
-          <w:numId w:val="1"/>
-        </w:numPr>
-      </w:pPr>
-      <w:r>
-        <w:t>データを保管しておく「場所」です。</w:t>
-      </w:r>
-    </w:p>
-    <w:p>
-      <w:pPr>
-        <w:numPr>
-          <w:ilvl w:val="1"/>
-          <w:numId w:val="1"/>
-        </w:numPr>
-      </w:pPr>
-      <w:r>
-        <w:t>役割：報告内容の保存、写真ファイルの保管。</w:t>
-      </w:r>
-    </w:p>
-    <w:p>
-      <w:pPr>
-        <w:numPr>
-          <w:ilvl w:val="1"/>
-          <w:numId w:val="1"/>
-        </w:numPr>
-      </w:pPr>
-      <w:r>
-        <w:t>例えるなら：</w:t>
-      </w:r>
-      <w:r>
-        <w:rPr>
-          <w:b/>
-          <w:bCs/>
-        </w:rPr>
-        <w:t>「帳簿（スプレッドシート）」と「倉庫（Googleドライブ）」</w:t>
-      </w:r>
-      <w:r>
-        <w:t> です。</w:t>
-      </w:r>
-    </w:p>
-    <w:p>
-      <w:r>
-        <w:pict w14:anchorId="76199EA1">
-          <v:rect id="_x0000_i1074" style="width:532.8pt;height:.75pt" o:hrpct="0" o:hralign="center" o:hrstd="t" o:hr="t" fillcolor="#a0a0a0" stroked="f">
+        <w:t>みんなが送った報告の文字や写真を安全にしまっておく役割です。</w:t>
+      </w:r>
+    </w:p>
+    <w:p>
+      <w:r>
+        <w:pict w14:anchorId="413E25F8">
+          <v:rect id="_x0000_i1066" style="width:532.8pt;height:.75pt" o:hrpct="0" o:hralign="center" o:hrstd="t" o:hr="t" fillcolor="#a0a0a0" stroked="f">
             <v:textbox inset="5.85pt,.7pt,5.85pt,.7pt"/>
           </v:rect>
         </w:pict>
@@ -253,10 +147,18 @@
       </w:pPr>
       <w:r>
         <w:rPr>
-          <w:b/>
-          <w:bCs/>
-        </w:rPr>
-        <w:t>2. ファイルごとの役割（</w:t>
+          <w:rFonts w:ascii="Segoe UI Emoji" w:hAnsi="Segoe UI Emoji" w:cs="Segoe UI Emoji"/>
+          <w:b/>
+          <w:bCs/>
+        </w:rPr>
+        <w:t>📝</w:t>
+      </w:r>
+      <w:r>
+        <w:rPr>
+          <w:b/>
+          <w:bCs/>
+        </w:rPr>
+        <w:t xml:space="preserve"> 以前のシステム（Googleスプレッドシート ＋ </w:t>
       </w:r>
       <w:proofErr w:type="spellStart"/>
       <w:r>
@@ -264,7 +166,7 @@
           <w:b/>
           <w:bCs/>
         </w:rPr>
-        <w:t>src</w:t>
+        <w:t>Vercel</w:t>
       </w:r>
       <w:proofErr w:type="spellEnd"/>
       <w:r>
@@ -272,475 +174,127 @@
           <w:b/>
           <w:bCs/>
         </w:rPr>
-        <w:t>フォルダ）</w:t>
-      </w:r>
-    </w:p>
-    <w:p>
-      <w:r>
-        <w:t>アプリの見た目や動きを決めている主要なファイルを解説します。</w:t>
-      </w:r>
-    </w:p>
-    <w:tbl>
-      <w:tblPr>
-        <w:tblW w:w="0" w:type="auto"/>
-        <w:tblCellSpacing w:w="15" w:type="dxa"/>
-        <w:tblBorders>
-          <w:top w:val="single" w:sz="2" w:space="0" w:color="auto"/>
-          <w:left w:val="single" w:sz="2" w:space="0" w:color="auto"/>
-          <w:bottom w:val="single" w:sz="2" w:space="0" w:color="auto"/>
-          <w:right w:val="single" w:sz="2" w:space="0" w:color="auto"/>
-        </w:tblBorders>
-        <w:tblCellMar>
-          <w:top w:w="15" w:type="dxa"/>
-          <w:left w:w="15" w:type="dxa"/>
-          <w:bottom w:w="15" w:type="dxa"/>
-          <w:right w:w="15" w:type="dxa"/>
-        </w:tblCellMar>
-        <w:tblLook w:val="04A0" w:firstRow="1" w:lastRow="0" w:firstColumn="1" w:lastColumn="0" w:noHBand="0" w:noVBand="1"/>
-      </w:tblPr>
-      <w:tblGrid>
-        <w:gridCol w:w="1709"/>
-        <w:gridCol w:w="1155"/>
-        <w:gridCol w:w="5634"/>
-      </w:tblGrid>
-      <w:tr>
-        <w:trPr>
-          <w:tblHeader/>
-          <w:tblCellSpacing w:w="15" w:type="dxa"/>
-        </w:trPr>
-        <w:tc>
-          <w:tcPr>
-            <w:tcW w:w="0" w:type="auto"/>
-            <w:tcBorders>
-              <w:top w:val="single" w:sz="2" w:space="0" w:color="auto"/>
-              <w:left w:val="single" w:sz="2" w:space="0" w:color="auto"/>
-              <w:bottom w:val="single" w:sz="6" w:space="0" w:color="auto"/>
-              <w:right w:val="single" w:sz="6" w:space="0" w:color="auto"/>
-            </w:tcBorders>
-            <w:vAlign w:val="center"/>
-            <w:hideMark/>
-          </w:tcPr>
-          <w:p>
-            <w:r>
-              <w:t>ファイル名</w:t>
-            </w:r>
-          </w:p>
-        </w:tc>
-        <w:tc>
-          <w:tcPr>
-            <w:tcW w:w="0" w:type="auto"/>
-            <w:tcBorders>
-              <w:top w:val="single" w:sz="2" w:space="0" w:color="auto"/>
-              <w:left w:val="single" w:sz="6" w:space="0" w:color="auto"/>
-              <w:bottom w:val="single" w:sz="6" w:space="0" w:color="auto"/>
-              <w:right w:val="single" w:sz="6" w:space="0" w:color="auto"/>
-            </w:tcBorders>
-            <w:vAlign w:val="center"/>
-            <w:hideMark/>
-          </w:tcPr>
-          <w:p>
-            <w:r>
-              <w:t>役割（一言で言うと）</w:t>
-            </w:r>
-          </w:p>
-        </w:tc>
-        <w:tc>
-          <w:tcPr>
-            <w:tcW w:w="0" w:type="auto"/>
-            <w:tcBorders>
-              <w:top w:val="single" w:sz="2" w:space="0" w:color="auto"/>
-              <w:left w:val="single" w:sz="6" w:space="0" w:color="auto"/>
-              <w:bottom w:val="single" w:sz="6" w:space="0" w:color="auto"/>
-              <w:right w:val="single" w:sz="2" w:space="0" w:color="auto"/>
-            </w:tcBorders>
-            <w:vAlign w:val="center"/>
-            <w:hideMark/>
-          </w:tcPr>
-          <w:p>
-            <w:r>
-              <w:t>詳しい内容</w:t>
-            </w:r>
-          </w:p>
-        </w:tc>
-      </w:tr>
-      <w:tr>
-        <w:trPr>
-          <w:tblCellSpacing w:w="15" w:type="dxa"/>
-        </w:trPr>
-        <w:tc>
-          <w:tcPr>
-            <w:tcW w:w="0" w:type="auto"/>
-            <w:tcBorders>
-              <w:top w:val="single" w:sz="6" w:space="0" w:color="auto"/>
-              <w:left w:val="single" w:sz="2" w:space="0" w:color="auto"/>
-              <w:bottom w:val="single" w:sz="6" w:space="0" w:color="auto"/>
-              <w:right w:val="single" w:sz="6" w:space="0" w:color="auto"/>
-            </w:tcBorders>
-            <w:vAlign w:val="center"/>
-            <w:hideMark/>
-          </w:tcPr>
-          <w:p>
-            <w:proofErr w:type="spellStart"/>
-            <w:r>
-              <w:rPr>
-                <w:b/>
-                <w:bCs/>
-              </w:rPr>
-              <w:t>App.jsx</w:t>
-            </w:r>
-            <w:proofErr w:type="spellEnd"/>
-          </w:p>
-        </w:tc>
-        <w:tc>
-          <w:tcPr>
-            <w:tcW w:w="0" w:type="auto"/>
-            <w:tcBorders>
-              <w:top w:val="single" w:sz="6" w:space="0" w:color="auto"/>
-              <w:left w:val="single" w:sz="6" w:space="0" w:color="auto"/>
-              <w:bottom w:val="single" w:sz="6" w:space="0" w:color="auto"/>
-              <w:right w:val="single" w:sz="6" w:space="0" w:color="auto"/>
-            </w:tcBorders>
-            <w:vAlign w:val="center"/>
-            <w:hideMark/>
-          </w:tcPr>
-          <w:p>
-            <w:r>
-              <w:rPr>
-                <w:b/>
-                <w:bCs/>
-              </w:rPr>
-              <w:t>アプリの玄関</w:t>
-            </w:r>
-          </w:p>
-        </w:tc>
-        <w:tc>
-          <w:tcPr>
-            <w:tcW w:w="0" w:type="auto"/>
-            <w:tcBorders>
-              <w:top w:val="single" w:sz="6" w:space="0" w:color="auto"/>
-              <w:left w:val="single" w:sz="6" w:space="0" w:color="auto"/>
-              <w:bottom w:val="single" w:sz="6" w:space="0" w:color="auto"/>
-              <w:right w:val="single" w:sz="2" w:space="0" w:color="auto"/>
-            </w:tcBorders>
-            <w:vAlign w:val="center"/>
-            <w:hideMark/>
-          </w:tcPr>
-          <w:p>
-            <w:r>
-              <w:t>アプリを開いた時に最初に読み込まれます。「報告画面」「タイムライン」「LIVE」の切り替え（ナビゲーション）を管理しています。</w:t>
-            </w:r>
-          </w:p>
-        </w:tc>
-      </w:tr>
-      <w:tr>
-        <w:trPr>
-          <w:tblCellSpacing w:w="15" w:type="dxa"/>
-        </w:trPr>
-        <w:tc>
-          <w:tcPr>
-            <w:tcW w:w="0" w:type="auto"/>
-            <w:tcBorders>
-              <w:top w:val="single" w:sz="6" w:space="0" w:color="auto"/>
-              <w:left w:val="single" w:sz="2" w:space="0" w:color="auto"/>
-              <w:bottom w:val="single" w:sz="6" w:space="0" w:color="auto"/>
-              <w:right w:val="single" w:sz="6" w:space="0" w:color="auto"/>
-            </w:tcBorders>
-            <w:vAlign w:val="center"/>
-            <w:hideMark/>
-          </w:tcPr>
-          <w:p>
-            <w:proofErr w:type="spellStart"/>
-            <w:r>
-              <w:rPr>
-                <w:b/>
-                <w:bCs/>
-              </w:rPr>
-              <w:t>ReportForm.jsx</w:t>
-            </w:r>
-            <w:proofErr w:type="spellEnd"/>
-          </w:p>
-        </w:tc>
-        <w:tc>
-          <w:tcPr>
-            <w:tcW w:w="0" w:type="auto"/>
-            <w:tcBorders>
-              <w:top w:val="single" w:sz="6" w:space="0" w:color="auto"/>
-              <w:left w:val="single" w:sz="6" w:space="0" w:color="auto"/>
-              <w:bottom w:val="single" w:sz="6" w:space="0" w:color="auto"/>
-              <w:right w:val="single" w:sz="6" w:space="0" w:color="auto"/>
-            </w:tcBorders>
-            <w:vAlign w:val="center"/>
-            <w:hideMark/>
-          </w:tcPr>
-          <w:p>
-            <w:r>
-              <w:rPr>
-                <w:b/>
-                <w:bCs/>
-              </w:rPr>
-              <w:t>報告書の書き込み画面</w:t>
-            </w:r>
-          </w:p>
-        </w:tc>
-        <w:tc>
-          <w:tcPr>
-            <w:tcW w:w="0" w:type="auto"/>
-            <w:tcBorders>
-              <w:top w:val="single" w:sz="6" w:space="0" w:color="auto"/>
-              <w:left w:val="single" w:sz="6" w:space="0" w:color="auto"/>
-              <w:bottom w:val="single" w:sz="6" w:space="0" w:color="auto"/>
-              <w:right w:val="single" w:sz="2" w:space="0" w:color="auto"/>
-            </w:tcBorders>
-            <w:vAlign w:val="center"/>
-            <w:hideMark/>
-          </w:tcPr>
-          <w:p>
-            <w:r>
-              <w:t>所属分団を選んだり、災害内容を入力したりする画面です。入力された内容を一時的に保存</w:t>
-            </w:r>
-            <w:proofErr w:type="gramStart"/>
-            <w:r>
-              <w:t>したり</w:t>
-            </w:r>
-            <w:proofErr w:type="gramEnd"/>
-            <w:r>
-              <w:t>、送信ボタンを押した時にGASに送り出す処理も担当しています。</w:t>
-            </w:r>
-          </w:p>
-        </w:tc>
-      </w:tr>
-      <w:tr>
-        <w:trPr>
-          <w:tblCellSpacing w:w="15" w:type="dxa"/>
-        </w:trPr>
-        <w:tc>
-          <w:tcPr>
-            <w:tcW w:w="0" w:type="auto"/>
-            <w:tcBorders>
-              <w:top w:val="single" w:sz="6" w:space="0" w:color="auto"/>
-              <w:left w:val="single" w:sz="2" w:space="0" w:color="auto"/>
-              <w:bottom w:val="single" w:sz="6" w:space="0" w:color="auto"/>
-              <w:right w:val="single" w:sz="6" w:space="0" w:color="auto"/>
-            </w:tcBorders>
-            <w:vAlign w:val="center"/>
-            <w:hideMark/>
-          </w:tcPr>
-          <w:p>
-            <w:proofErr w:type="spellStart"/>
-            <w:r>
-              <w:rPr>
-                <w:b/>
-                <w:bCs/>
-              </w:rPr>
-              <w:t>ReportHistory.jsx</w:t>
-            </w:r>
-            <w:proofErr w:type="spellEnd"/>
-          </w:p>
-        </w:tc>
-        <w:tc>
-          <w:tcPr>
-            <w:tcW w:w="0" w:type="auto"/>
-            <w:tcBorders>
-              <w:top w:val="single" w:sz="6" w:space="0" w:color="auto"/>
-              <w:left w:val="single" w:sz="6" w:space="0" w:color="auto"/>
-              <w:bottom w:val="single" w:sz="6" w:space="0" w:color="auto"/>
-              <w:right w:val="single" w:sz="6" w:space="0" w:color="auto"/>
-            </w:tcBorders>
-            <w:vAlign w:val="center"/>
-            <w:hideMark/>
-          </w:tcPr>
-          <w:p>
-            <w:r>
-              <w:rPr>
-                <w:b/>
-                <w:bCs/>
-              </w:rPr>
-              <w:t>タイムライ</w:t>
-            </w:r>
-            <w:r>
-              <w:rPr>
-                <w:b/>
-                <w:bCs/>
-              </w:rPr>
-              <w:lastRenderedPageBreak/>
-              <w:t>ン（履歴）画面</w:t>
-            </w:r>
-          </w:p>
-        </w:tc>
-        <w:tc>
-          <w:tcPr>
-            <w:tcW w:w="0" w:type="auto"/>
-            <w:tcBorders>
-              <w:top w:val="single" w:sz="6" w:space="0" w:color="auto"/>
-              <w:left w:val="single" w:sz="6" w:space="0" w:color="auto"/>
-              <w:bottom w:val="single" w:sz="6" w:space="0" w:color="auto"/>
-              <w:right w:val="single" w:sz="2" w:space="0" w:color="auto"/>
-            </w:tcBorders>
-            <w:vAlign w:val="center"/>
-            <w:hideMark/>
-          </w:tcPr>
-          <w:p>
-            <w:r>
-              <w:lastRenderedPageBreak/>
-              <w:t>これまで登録されたすべての情報をスプレッドシートから</w:t>
-            </w:r>
-            <w:r>
-              <w:lastRenderedPageBreak/>
-              <w:t>読み取って、見やすいリスト形式で表示します。Windowsで見ているダッシュボードもこれに近い仕組みです。</w:t>
-            </w:r>
-          </w:p>
-        </w:tc>
-      </w:tr>
-      <w:tr>
-        <w:trPr>
-          <w:tblCellSpacing w:w="15" w:type="dxa"/>
-        </w:trPr>
-        <w:tc>
-          <w:tcPr>
-            <w:tcW w:w="0" w:type="auto"/>
-            <w:tcBorders>
-              <w:top w:val="single" w:sz="6" w:space="0" w:color="auto"/>
-              <w:left w:val="single" w:sz="2" w:space="0" w:color="auto"/>
-              <w:bottom w:val="single" w:sz="6" w:space="0" w:color="auto"/>
-              <w:right w:val="single" w:sz="6" w:space="0" w:color="auto"/>
-            </w:tcBorders>
-            <w:vAlign w:val="center"/>
-            <w:hideMark/>
-          </w:tcPr>
-          <w:p>
-            <w:proofErr w:type="spellStart"/>
-            <w:r>
-              <w:rPr>
-                <w:b/>
-                <w:bCs/>
-              </w:rPr>
-              <w:lastRenderedPageBreak/>
-              <w:t>LiveView.jsx</w:t>
-            </w:r>
-            <w:proofErr w:type="spellEnd"/>
-          </w:p>
-        </w:tc>
-        <w:tc>
-          <w:tcPr>
-            <w:tcW w:w="0" w:type="auto"/>
-            <w:tcBorders>
-              <w:top w:val="single" w:sz="6" w:space="0" w:color="auto"/>
-              <w:left w:val="single" w:sz="6" w:space="0" w:color="auto"/>
-              <w:bottom w:val="single" w:sz="6" w:space="0" w:color="auto"/>
-              <w:right w:val="single" w:sz="6" w:space="0" w:color="auto"/>
-            </w:tcBorders>
-            <w:vAlign w:val="center"/>
-            <w:hideMark/>
-          </w:tcPr>
-          <w:p>
-            <w:r>
-              <w:rPr>
-                <w:b/>
-                <w:bCs/>
-              </w:rPr>
-              <w:t>LIVE中継の心臓部</w:t>
-            </w:r>
-          </w:p>
-        </w:tc>
-        <w:tc>
-          <w:tcPr>
-            <w:tcW w:w="0" w:type="auto"/>
-            <w:tcBorders>
-              <w:top w:val="single" w:sz="6" w:space="0" w:color="auto"/>
-              <w:left w:val="single" w:sz="6" w:space="0" w:color="auto"/>
-              <w:bottom w:val="single" w:sz="6" w:space="0" w:color="auto"/>
-              <w:right w:val="single" w:sz="2" w:space="0" w:color="auto"/>
-            </w:tcBorders>
-            <w:vAlign w:val="center"/>
-            <w:hideMark/>
-          </w:tcPr>
-          <w:p>
-            <w:r>
-              <w:t>カメラで撮影した画像を「3秒おき」に小さく加工して送信する、このアプリ独自の技術が詰まった場所です。受信側の画面もここで管理されています。</w:t>
-            </w:r>
-          </w:p>
-        </w:tc>
-      </w:tr>
-      <w:tr>
-        <w:trPr>
-          <w:tblCellSpacing w:w="15" w:type="dxa"/>
-        </w:trPr>
-        <w:tc>
-          <w:tcPr>
-            <w:tcW w:w="0" w:type="auto"/>
-            <w:tcBorders>
-              <w:top w:val="single" w:sz="6" w:space="0" w:color="auto"/>
-              <w:left w:val="single" w:sz="2" w:space="0" w:color="auto"/>
-              <w:bottom w:val="single" w:sz="2" w:space="0" w:color="auto"/>
-              <w:right w:val="single" w:sz="6" w:space="0" w:color="auto"/>
-            </w:tcBorders>
-            <w:vAlign w:val="center"/>
-            <w:hideMark/>
-          </w:tcPr>
-          <w:p>
-            <w:r>
-              <w:rPr>
-                <w:b/>
-                <w:bCs/>
-              </w:rPr>
-              <w:t>lib/db.js</w:t>
-            </w:r>
-          </w:p>
-        </w:tc>
-        <w:tc>
-          <w:tcPr>
-            <w:tcW w:w="0" w:type="auto"/>
-            <w:tcBorders>
-              <w:top w:val="single" w:sz="6" w:space="0" w:color="auto"/>
-              <w:left w:val="single" w:sz="6" w:space="0" w:color="auto"/>
-              <w:bottom w:val="single" w:sz="2" w:space="0" w:color="auto"/>
-              <w:right w:val="single" w:sz="6" w:space="0" w:color="auto"/>
-            </w:tcBorders>
-            <w:vAlign w:val="center"/>
-            <w:hideMark/>
-          </w:tcPr>
-          <w:p>
-            <w:r>
-              <w:rPr>
-                <w:b/>
-                <w:bCs/>
-              </w:rPr>
-              <w:t>記憶の管理人</w:t>
-            </w:r>
-          </w:p>
-        </w:tc>
-        <w:tc>
-          <w:tcPr>
-            <w:tcW w:w="0" w:type="auto"/>
-            <w:tcBorders>
-              <w:top w:val="single" w:sz="6" w:space="0" w:color="auto"/>
-              <w:left w:val="single" w:sz="6" w:space="0" w:color="auto"/>
-              <w:bottom w:val="single" w:sz="2" w:space="0" w:color="auto"/>
-              <w:right w:val="single" w:sz="2" w:space="0" w:color="auto"/>
-            </w:tcBorders>
-            <w:vAlign w:val="center"/>
-            <w:hideMark/>
-          </w:tcPr>
-          <w:p>
-            <w:r>
-              <w:t>ブラウザ内の「</w:t>
-            </w:r>
-            <w:proofErr w:type="spellStart"/>
-            <w:r>
-              <w:t>IndexedDB</w:t>
-            </w:r>
-            <w:proofErr w:type="spellEnd"/>
-            <w:r>
-              <w:t>」という小さな記憶エリアを管理します。電波がなくても入力を覚えていられるのは、この管理人のおかげです。</w:t>
-            </w:r>
-          </w:p>
-        </w:tc>
-      </w:tr>
-    </w:tbl>
-    <w:p>
-      <w:r>
-        <w:pict w14:anchorId="4FE77562">
-          <v:rect id="_x0000_i1075" style="width:532.8pt;height:.75pt" o:hrpct="0" o:hralign="center" o:hrstd="t" o:hr="t" fillcolor="#a0a0a0" stroked="f">
+        <w:t>）</w:t>
+      </w:r>
+    </w:p>
+    <w:p>
+      <w:r>
+        <w:t>以前は、手軽に作れることを優先して、身近なツールを組み合わせていました。</w:t>
+      </w:r>
+    </w:p>
+    <w:p>
+      <w:pPr>
+        <w:numPr>
+          <w:ilvl w:val="0"/>
+          <w:numId w:val="8"/>
+        </w:numPr>
+      </w:pPr>
+      <w:r>
+        <w:rPr>
+          <w:b/>
+          <w:bCs/>
+        </w:rPr>
+        <w:t>倉庫（データ保存）＝ Googleスプレッドシート</w:t>
+      </w:r>
+    </w:p>
+    <w:p>
+      <w:pPr>
+        <w:numPr>
+          <w:ilvl w:val="1"/>
+          <w:numId w:val="8"/>
+        </w:numPr>
+      </w:pPr>
+      <w:r>
+        <w:rPr>
+          <w:b/>
+          <w:bCs/>
+        </w:rPr>
+        <w:t>【例え】「1冊の共有ノート」</w:t>
+      </w:r>
+    </w:p>
+    <w:p>
+      <w:pPr>
+        <w:numPr>
+          <w:ilvl w:val="1"/>
+          <w:numId w:val="8"/>
+        </w:numPr>
+      </w:pPr>
+      <w:r>
+        <w:t>みんなで1冊のノートを回し書きしているような状態でした。</w:t>
+      </w:r>
+    </w:p>
+    <w:p>
+      <w:pPr>
+        <w:numPr>
+          <w:ilvl w:val="1"/>
+          <w:numId w:val="8"/>
+        </w:numPr>
+      </w:pPr>
+      <w:r>
+        <w:rPr>
+          <w:b/>
+          <w:bCs/>
+        </w:rPr>
+        <w:t>弱点:</w:t>
+      </w:r>
+      <w:r>
+        <w:t> もし災害が起きて、50人の団員がいっせいに書き込もうとすると、「順番待ち」が発生して</w:t>
+      </w:r>
+      <w:proofErr w:type="gramStart"/>
+      <w:r>
+        <w:t>書き込めなかったり</w:t>
+      </w:r>
+      <w:proofErr w:type="gramEnd"/>
+      <w:r>
+        <w:t>（エラー）、反映されるまでに数秒〜十数秒もかかってしまうという大きな問題がありました。</w:t>
+      </w:r>
+    </w:p>
+    <w:p>
+      <w:pPr>
+        <w:numPr>
+          <w:ilvl w:val="0"/>
+          <w:numId w:val="8"/>
+        </w:numPr>
+      </w:pPr>
+      <w:r>
+        <w:rPr>
+          <w:b/>
+          <w:bCs/>
+        </w:rPr>
+        <w:t xml:space="preserve">ショーウィンドウ（画面）＝ </w:t>
+      </w:r>
+      <w:proofErr w:type="spellStart"/>
+      <w:r>
+        <w:rPr>
+          <w:b/>
+          <w:bCs/>
+        </w:rPr>
+        <w:t>Vercel</w:t>
+      </w:r>
+      <w:proofErr w:type="spellEnd"/>
+      <w:r>
+        <w:rPr>
+          <w:b/>
+          <w:bCs/>
+        </w:rPr>
+        <w:t>（バーセル）</w:t>
+      </w:r>
+    </w:p>
+    <w:p>
+      <w:pPr>
+        <w:numPr>
+          <w:ilvl w:val="1"/>
+          <w:numId w:val="8"/>
+        </w:numPr>
+      </w:pPr>
+      <w:r>
+        <w:t>優秀なショーウィンドウでしたが、海外のサーバーを経由することが多く、日本国内からのアクセスだと少しだけ表示に時間がかかることがありました。</w:t>
+      </w:r>
+    </w:p>
+    <w:p>
+      <w:r>
+        <w:pict w14:anchorId="084369FF">
+          <v:rect id="_x0000_i1067" style="width:532.8pt;height:.75pt" o:hrpct="0" o:hralign="center" o:hrstd="t" o:hr="t" fillcolor="#a0a0a0" stroked="f">
             <v:textbox inset="5.85pt,.7pt,5.85pt,.7pt"/>
           </v:rect>
         </w:pict>
@@ -755,22 +309,35 @@
       </w:pPr>
       <w:r>
         <w:rPr>
-          <w:b/>
-          <w:bCs/>
-        </w:rPr>
-        <w:t>3. 保存の仕組み（backend/code.gs）</w:t>
-      </w:r>
-    </w:p>
-    <w:p>
-      <w:r>
-        <w:t>Googleのクラウド上で動いている唯一のファイルです。</w:t>
+          <w:rFonts w:ascii="Segoe UI Emoji" w:hAnsi="Segoe UI Emoji" w:cs="Segoe UI Emoji"/>
+          <w:b/>
+          <w:bCs/>
+        </w:rPr>
+        <w:t>🚀</w:t>
+      </w:r>
+      <w:r>
+        <w:rPr>
+          <w:b/>
+          <w:bCs/>
+        </w:rPr>
+        <w:t xml:space="preserve"> 現在のシステム（Firebase ＋ Cloudflare Pages）</w:t>
+      </w:r>
+    </w:p>
+    <w:p>
+      <w:r>
+        <w:t>災害という**「1秒を争う、絶対に失敗が許されない状況」**に特化するため、世界トップクラスのプロ（大手企業）が使う仕組みにパワーアップしました！</w:t>
+      </w:r>
+    </w:p>
+    <w:p>
+      <w:r>
+        <w:t>1. 倉庫（データ保存）＝ Firebase (Googleのプロ向けシステム)</w:t>
       </w:r>
     </w:p>
     <w:p>
       <w:pPr>
         <w:numPr>
           <w:ilvl w:val="0"/>
-          <w:numId w:val="2"/>
+          <w:numId w:val="9"/>
         </w:numPr>
       </w:pPr>
       <w:r>
@@ -778,86 +345,126 @@
           <w:b/>
           <w:bCs/>
         </w:rPr>
-        <w:t>setup関数</w:t>
-      </w:r>
-      <w:r>
-        <w:t>: 最初の一回だけ実行する「準備運動」です。スプレッドシートに「報告」や「LIVE用」のシートを自動で作ります。</w:t>
+        <w:t>【例え】「超高速な電子掲示板システム」</w:t>
       </w:r>
     </w:p>
     <w:p>
       <w:pPr>
         <w:numPr>
           <w:ilvl w:val="0"/>
-          <w:numId w:val="2"/>
+          <w:numId w:val="9"/>
         </w:numPr>
       </w:pPr>
-      <w:proofErr w:type="spellStart"/>
-      <w:r>
-        <w:rPr>
-          <w:b/>
-          <w:bCs/>
-        </w:rPr>
-        <w:t>doPost</w:t>
-      </w:r>
-      <w:proofErr w:type="spellEnd"/>
-      <w:r>
-        <w:rPr>
-          <w:b/>
-          <w:bCs/>
-        </w:rPr>
-        <w:t>関数</w:t>
-      </w:r>
-      <w:r>
-        <w:t>: スマホからデータが飛んできた時に呼ばれる「受付窓口」です。</w:t>
+      <w:r>
+        <w:rPr>
+          <w:b/>
+          <w:bCs/>
+        </w:rPr>
+        <w:t>ここが凄い！：</w:t>
+      </w:r>
+      <w:r>
+        <w:t> ノートの順番待ちではなくなりました。100人が同時に「送信」ボタンを押しても、</w:t>
+      </w:r>
+      <w:r>
+        <w:rPr>
+          <w:b/>
+          <w:bCs/>
+        </w:rPr>
+        <w:t>0.1秒以下で全員の書き込みが同時に完了</w:t>
+      </w:r>
+      <w:r>
+        <w:t>し、他の人のスマホ画面が一瞬で更新されます。</w:t>
       </w:r>
     </w:p>
     <w:p>
       <w:pPr>
         <w:numPr>
-          <w:ilvl w:val="1"/>
-          <w:numId w:val="2"/>
+          <w:ilvl w:val="0"/>
+          <w:numId w:val="9"/>
         </w:numPr>
       </w:pPr>
       <w:r>
-        <w:t>「LIVE中継中だよ」と来れば、LIVE用のシートを更新します。</w:t>
+        <w:rPr>
+          <w:b/>
+          <w:bCs/>
+        </w:rPr>
+        <w:t>写真もサクサク：</w:t>
+      </w:r>
+      <w:r>
+        <w:t> 写真を保存するための専用の大容量フォルダ（Firebase Storage）も備わっており、重い現場写真も一瞬でアップロード・共有されます。</w:t>
       </w:r>
     </w:p>
     <w:p>
       <w:pPr>
         <w:numPr>
-          <w:ilvl w:val="1"/>
-          <w:numId w:val="2"/>
+          <w:ilvl w:val="0"/>
+          <w:numId w:val="9"/>
         </w:numPr>
       </w:pPr>
       <w:r>
-        <w:t>「新しい報告だよ」と来れば、報告用のシートに1行追加します。</w:t>
+        <w:rPr>
+          <w:b/>
+          <w:bCs/>
+        </w:rPr>
+        <w:lastRenderedPageBreak/>
+        <w:t>オフラインに強い：</w:t>
+      </w:r>
+      <w:r>
+        <w:t> 山の中など、電波が一瞬途切れる場所で「送信」を押しても、データがスマホの中に一時保存され、電波が復活した瞬間に自動で送信される「絶対に消えない仕組み」が入っています。</w:t>
+      </w:r>
+    </w:p>
+    <w:p>
+      <w:r>
+        <w:t>2. ショーウィンドウ（画面）＝ Cloudflare Pages</w:t>
       </w:r>
     </w:p>
     <w:p>
       <w:pPr>
         <w:numPr>
-          <w:ilvl w:val="1"/>
-          <w:numId w:val="2"/>
+          <w:ilvl w:val="0"/>
+          <w:numId w:val="10"/>
         </w:numPr>
       </w:pPr>
       <w:r>
-        <w:t>最近の修正で、</w:t>
-      </w:r>
-      <w:r>
-        <w:rPr>
-          <w:b/>
-          <w:bCs/>
-        </w:rPr>
-        <w:t>「同じIDなら上書きする」「最新順に並べ替える」</w:t>
-      </w:r>
-      <w:r>
-        <w:t> という賢い処理もここに追加されました。</w:t>
-      </w:r>
-    </w:p>
-    <w:p>
-      <w:r>
-        <w:pict w14:anchorId="7D8F03D8">
-          <v:rect id="_x0000_i1076" style="width:532.8pt;height:.75pt" o:hrpct="0" o:hralign="center" o:hrstd="t" o:hr="t" fillcolor="#a0a0a0" stroked="f">
+        <w:rPr>
+          <w:b/>
+          <w:bCs/>
+        </w:rPr>
+        <w:t>【例え】「全国各地にある超高速なデリバリー網」</w:t>
+      </w:r>
+    </w:p>
+    <w:p>
+      <w:pPr>
+        <w:numPr>
+          <w:ilvl w:val="0"/>
+          <w:numId w:val="10"/>
+        </w:numPr>
+      </w:pPr>
+      <w:r>
+        <w:rPr>
+          <w:b/>
+          <w:bCs/>
+        </w:rPr>
+        <w:t>ここが凄い！：</w:t>
+      </w:r>
+      <w:r>
+        <w:t> Cloudflare（クラウドフレア）は、世界中のインターネットの速度を爆速にしている会社です。アプリを開いた瞬間、あなたのいる場所から</w:t>
+      </w:r>
+      <w:r>
+        <w:rPr>
+          <w:b/>
+          <w:bCs/>
+        </w:rPr>
+        <w:t>一番近い日本のサーバー</w:t>
+      </w:r>
+      <w:r>
+        <w:t>から画面が送られてくるので、電波が弱い災害現場でも、アプリがパッと一瞬で起動します。</w:t>
+      </w:r>
+    </w:p>
+    <w:p>
+      <w:r>
+        <w:pict w14:anchorId="1D461961">
+          <v:rect id="_x0000_i1068" style="width:532.8pt;height:.75pt" o:hrpct="0" o:hralign="center" o:hrstd="t" o:hr="t" fillcolor="#a0a0a0" stroked="f">
             <v:textbox inset="5.85pt,.7pt,5.85pt,.7pt"/>
           </v:rect>
         </w:pict>
@@ -872,578 +479,51 @@
       </w:pPr>
       <w:r>
         <w:rPr>
-          <w:b/>
-          <w:bCs/>
-        </w:rPr>
-        <w:t>4. データが流れる順番（ストーリー）</w:t>
-      </w:r>
-    </w:p>
-    <w:p>
-      <w:r>
-        <w:t>例えば、あなたが現場で「活動状況」を更新した時の流れはこうです：</w:t>
-      </w:r>
-    </w:p>
-    <w:p>
-      <w:pPr>
-        <w:numPr>
-          <w:ilvl w:val="0"/>
-          <w:numId w:val="3"/>
-        </w:numPr>
-      </w:pPr>
-      <w:r>
-        <w:rPr>
-          <w:b/>
-          <w:bCs/>
-        </w:rPr>
-        <w:t>スマホ画面（</w:t>
-      </w:r>
-      <w:proofErr w:type="spellStart"/>
-      <w:r>
-        <w:rPr>
-          <w:b/>
-          <w:bCs/>
-        </w:rPr>
-        <w:t>ReportForm</w:t>
-      </w:r>
-      <w:proofErr w:type="spellEnd"/>
-      <w:r>
-        <w:rPr>
-          <w:b/>
-          <w:bCs/>
-        </w:rPr>
-        <w:t>）</w:t>
-      </w:r>
-      <w:r>
-        <w:t>: あなたが「対応中」から「終了」にポチッと変えて送信ボタンを押します。</w:t>
-      </w:r>
-    </w:p>
-    <w:p>
-      <w:pPr>
-        <w:numPr>
-          <w:ilvl w:val="0"/>
-          <w:numId w:val="3"/>
-        </w:numPr>
-      </w:pPr>
-      <w:r>
-        <w:rPr>
-          <w:b/>
-          <w:bCs/>
-        </w:rPr>
-        <w:t>記憶の管理人（db.js）</w:t>
-      </w:r>
-      <w:r>
-        <w:t>: スマホの中に「ID:123 の状態が『終了』になった」と一旦メモします。</w:t>
-      </w:r>
-    </w:p>
-    <w:p>
-      <w:pPr>
-        <w:numPr>
-          <w:ilvl w:val="0"/>
-          <w:numId w:val="3"/>
-        </w:numPr>
-      </w:pPr>
-      <w:r>
-        <w:rPr>
-          <w:b/>
-          <w:bCs/>
-        </w:rPr>
-        <w:t>インターネット</w:t>
-      </w:r>
-      <w:r>
-        <w:t>: スマホがGoogleのサーバーに「ID:123 は『終了』だってさ！」とパケット（データ）を送ります。</w:t>
-      </w:r>
-    </w:p>
-    <w:p>
-      <w:pPr>
-        <w:numPr>
-          <w:ilvl w:val="0"/>
-          <w:numId w:val="3"/>
-        </w:numPr>
-      </w:pPr>
-      <w:r>
-        <w:rPr>
-          <w:b/>
-          <w:bCs/>
-        </w:rPr>
-        <w:t>受付窓口（code.gs）</w:t>
-      </w:r>
-      <w:r>
-        <w:t>: GASがそのデータを受け取り、スプレッドシートの「ID」列を上から探します。</w:t>
-      </w:r>
-    </w:p>
-    <w:p>
-      <w:pPr>
-        <w:numPr>
-          <w:ilvl w:val="0"/>
-          <w:numId w:val="3"/>
-        </w:numPr>
-      </w:pPr>
-      <w:r>
-        <w:rPr>
-          <w:b/>
-          <w:bCs/>
-        </w:rPr>
-        <w:t>帳簿（スプレッドシート）</w:t>
-      </w:r>
-      <w:r>
-        <w:t>: 「あ、ID:123 があった。ここを『終了』に書き換えよう！」と既存の行を修正します。</w:t>
-      </w:r>
-    </w:p>
-    <w:p>
-      <w:pPr>
-        <w:numPr>
-          <w:ilvl w:val="0"/>
-          <w:numId w:val="3"/>
-        </w:numPr>
-      </w:pPr>
-      <w:r>
-        <w:rPr>
-          <w:b/>
-          <w:bCs/>
-        </w:rPr>
-        <w:t>タイムライン（</w:t>
-      </w:r>
-      <w:proofErr w:type="spellStart"/>
-      <w:r>
-        <w:rPr>
-          <w:b/>
-          <w:bCs/>
-        </w:rPr>
-        <w:t>ReportHistory</w:t>
-      </w:r>
-      <w:proofErr w:type="spellEnd"/>
-      <w:r>
-        <w:rPr>
-          <w:b/>
-          <w:bCs/>
-        </w:rPr>
-        <w:t>）</w:t>
-      </w:r>
-      <w:r>
-        <w:t>: Windowsで見ている人が画面を更新すると、スプレッドシートから「終了」という最新情報を読み取って表示されます。</w:t>
-      </w:r>
-    </w:p>
-    <w:p>
-      <w:r>
-        <w:lastRenderedPageBreak/>
-        <w:pict w14:anchorId="72936E1A">
-          <v:rect id="_x0000_i1077" style="width:532.8pt;height:.75pt" o:hrpct="0" o:hralign="center" o:hrstd="t" o:hr="t" fillcolor="#a0a0a0" stroked="f">
-            <v:textbox inset="5.85pt,.7pt,5.85pt,.7pt"/>
-          </v:rect>
-        </w:pict>
-      </w:r>
-    </w:p>
-    <w:p>
-      <w:pPr>
-        <w:rPr>
-          <w:b/>
-          <w:bCs/>
-        </w:rPr>
-      </w:pPr>
-      <w:r>
-        <w:rPr>
-          <w:b/>
-          <w:bCs/>
-        </w:rPr>
-        <w:t>5. LIVE配信の仕組み（なぜ「コマ送り」なのか？）</w:t>
-      </w:r>
-    </w:p>
-    <w:p>
-      <w:r>
-        <w:t>普通のYouTubeのような動画配信ではなく、パラパラ漫画のような「コマ送り」の仕組みを採用しています。</w:t>
-      </w:r>
-    </w:p>
-    <w:p>
-      <w:pPr>
-        <w:numPr>
-          <w:ilvl w:val="0"/>
-          <w:numId w:val="4"/>
-        </w:numPr>
-      </w:pPr>
-      <w:r>
-        <w:rPr>
-          <w:b/>
-          <w:bCs/>
-        </w:rPr>
-        <w:t>仕組み</w:t>
-      </w:r>
-      <w:r>
-        <w:t>: 3秒に1回、カメラが「写真」を撮り、それを超高速でGoogleに送ります。</w:t>
-      </w:r>
-    </w:p>
-    <w:p>
-      <w:pPr>
-        <w:numPr>
-          <w:ilvl w:val="0"/>
-          <w:numId w:val="4"/>
-        </w:numPr>
-      </w:pPr>
-      <w:r>
-        <w:rPr>
-          <w:b/>
-          <w:bCs/>
-        </w:rPr>
-        <w:t>メリット</w:t>
-      </w:r>
-      <w:r>
-        <w:t>:</w:t>
-      </w:r>
-    </w:p>
-    <w:p>
-      <w:pPr>
-        <w:numPr>
-          <w:ilvl w:val="1"/>
-          <w:numId w:val="4"/>
-        </w:numPr>
-      </w:pPr>
-      <w:r>
-        <w:rPr>
-          <w:b/>
-          <w:bCs/>
-        </w:rPr>
-        <w:t>電波に強い</w:t>
-      </w:r>
-      <w:r>
-        <w:t>: 動画は電波が弱いと止まりがちですが、写真は1枚ずつの送信なので、電波の悪い災害現場でも「最新の1枚」が届きやすいです。</w:t>
-      </w:r>
-    </w:p>
-    <w:p>
-      <w:pPr>
-        <w:numPr>
-          <w:ilvl w:val="1"/>
-          <w:numId w:val="4"/>
-        </w:numPr>
-      </w:pPr>
-      <w:r>
-        <w:rPr>
-          <w:b/>
-          <w:bCs/>
-        </w:rPr>
-        <w:t>コストゼロ</w:t>
-      </w:r>
-      <w:r>
-        <w:t>: 本格的な動画サーバーを使わずに、無料のGoogleスプレッドシートだけで「LIVE中継」を実現しています。</w:t>
-      </w:r>
-    </w:p>
-    <w:p>
-      <w:pPr>
-        <w:numPr>
-          <w:ilvl w:val="1"/>
-          <w:numId w:val="4"/>
-        </w:numPr>
-      </w:pPr>
-      <w:r>
-        <w:rPr>
-          <w:b/>
-          <w:bCs/>
-        </w:rPr>
-        <w:t>究極の軽量化</w:t>
-      </w:r>
-      <w:r>
-        <w:t>: 送信前に画像を </w:t>
-      </w:r>
-      <w:r>
-        <w:rPr>
-          <w:b/>
-          <w:bCs/>
-        </w:rPr>
-        <w:t>640px</w:t>
-      </w:r>
-      <w:r>
-        <w:t> というサイズに自動で小さくし、さらに </w:t>
-      </w:r>
-      <w:r>
-        <w:rPr>
-          <w:b/>
-          <w:bCs/>
-        </w:rPr>
-        <w:t>画質を30%</w:t>
-      </w:r>
-      <w:r>
-        <w:t> までギュッと圧縮しています。これにより、通信量を劇的に抑え、スマホへの負担も減らしています。</w:t>
-      </w:r>
-    </w:p>
-    <w:p>
-      <w:r>
-        <w:pict w14:anchorId="1CF3C65F">
-          <v:rect id="_x0000_i1078" style="width:532.8pt;height:.75pt" o:hrpct="0" o:hralign="center" o:hrstd="t" o:hr="t" fillcolor="#a0a0a0" stroked="f">
-            <v:textbox inset="5.85pt,.7pt,5.85pt,.7pt"/>
-          </v:rect>
-        </w:pict>
-      </w:r>
-    </w:p>
-    <w:p>
-      <w:pPr>
-        <w:rPr>
-          <w:b/>
-          <w:bCs/>
-        </w:rPr>
-      </w:pPr>
-      <w:r>
-        <w:rPr>
-          <w:b/>
-          <w:bCs/>
-        </w:rPr>
-        <w:t>6. オフラインで動く理由（電波がなくても安心な理由）</w:t>
-      </w:r>
-    </w:p>
-    <w:p>
-      <w:r>
-        <w:t>このアプリは、インターネットが繋がっていなくても入力ができる「オフラインファースト」という設計になっています。</w:t>
-      </w:r>
-    </w:p>
-    <w:p>
-      <w:pPr>
-        <w:numPr>
-          <w:ilvl w:val="0"/>
-          <w:numId w:val="5"/>
-        </w:numPr>
-      </w:pPr>
-      <w:r>
-        <w:rPr>
-          <w:b/>
-          <w:bCs/>
-        </w:rPr>
-        <w:t>仕組み</w:t>
-      </w:r>
-      <w:r>
-        <w:t>: 入力した内容は、ネットに送る前にまず </w:t>
-      </w:r>
-      <w:r>
-        <w:rPr>
-          <w:b/>
-          <w:bCs/>
-        </w:rPr>
-        <w:t>スマホ内部の「メモ帳（</w:t>
-      </w:r>
-      <w:proofErr w:type="spellStart"/>
-      <w:r>
-        <w:rPr>
-          <w:b/>
-          <w:bCs/>
-        </w:rPr>
-        <w:t>IndexedDB</w:t>
-      </w:r>
-      <w:proofErr w:type="spellEnd"/>
-      <w:r>
-        <w:rPr>
-          <w:b/>
-          <w:bCs/>
-        </w:rPr>
-        <w:t>）」</w:t>
-      </w:r>
-      <w:r>
-        <w:t> にガッチリ保存されます。</w:t>
-      </w:r>
-    </w:p>
-    <w:p>
-      <w:pPr>
-        <w:numPr>
-          <w:ilvl w:val="0"/>
-          <w:numId w:val="5"/>
-        </w:numPr>
-      </w:pPr>
-      <w:r>
-        <w:rPr>
-          <w:b/>
-          <w:bCs/>
-        </w:rPr>
-        <w:t>安心のポイント</w:t>
-      </w:r>
-      <w:r>
-        <w:t>:</w:t>
-      </w:r>
-    </w:p>
-    <w:p>
-      <w:pPr>
-        <w:numPr>
-          <w:ilvl w:val="1"/>
-          <w:numId w:val="5"/>
-        </w:numPr>
-      </w:pPr>
-      <w:r>
-        <w:t>あなたが「送信」を押すと、アプリはまず自分の「内蔵メモリ」に書き込みます。</w:t>
-      </w:r>
-    </w:p>
-    <w:p>
-      <w:pPr>
-        <w:numPr>
-          <w:ilvl w:val="1"/>
-          <w:numId w:val="5"/>
-        </w:numPr>
-      </w:pPr>
-      <w:r>
-        <w:t>その直後にインターネットが繋がっているかを確認します。</w:t>
-      </w:r>
-    </w:p>
-    <w:p>
-      <w:pPr>
-        <w:numPr>
-          <w:ilvl w:val="1"/>
-          <w:numId w:val="5"/>
-        </w:numPr>
-      </w:pPr>
-      <w:r>
-        <w:t>もし繋がっていればそのままGoogleへ送ります。</w:t>
-      </w:r>
-    </w:p>
-    <w:p>
-      <w:pPr>
-        <w:numPr>
-          <w:ilvl w:val="1"/>
-          <w:numId w:val="5"/>
-        </w:numPr>
-      </w:pPr>
-      <w:r>
-        <w:t>もし繋がっていなければ </w:t>
-      </w:r>
-      <w:r>
-        <w:rPr>
-          <w:b/>
-          <w:bCs/>
-        </w:rPr>
-        <w:t>「未送信」</w:t>
-      </w:r>
-      <w:r>
-        <w:t> としてキープし、電波が復活した時に送り直せるよう準備します。</w:t>
-      </w:r>
-    </w:p>
-    <w:p>
-      <w:pPr>
-        <w:numPr>
-          <w:ilvl w:val="0"/>
-          <w:numId w:val="5"/>
-        </w:numPr>
-      </w:pPr>
-      <w:r>
-        <w:t>これにより、せっかく入力した報告が「送信失敗」で消えてしまうという悲劇を防いでいます。</w:t>
-      </w:r>
-    </w:p>
-    <w:p>
-      <w:r>
-        <w:pict w14:anchorId="4F0DE5C8">
-          <v:rect id="_x0000_i1079" style="width:532.8pt;height:.75pt" o:hrpct="0" o:hralign="center" o:hrstd="t" o:hr="t" fillcolor="#a0a0a0" stroked="f">
-            <v:textbox inset="5.85pt,.7pt,5.85pt,.7pt"/>
-          </v:rect>
-        </w:pict>
-      </w:r>
-    </w:p>
-    <w:p>
-      <w:pPr>
-        <w:rPr>
-          <w:b/>
-          <w:bCs/>
-        </w:rPr>
-      </w:pPr>
-      <w:r>
-        <w:rPr>
-          <w:b/>
-          <w:bCs/>
-        </w:rPr>
-        <w:t>7. 使われている魔法の言葉（技術スタック）</w:t>
-      </w:r>
-    </w:p>
-    <w:p>
-      <w:pPr>
-        <w:numPr>
-          <w:ilvl w:val="0"/>
-          <w:numId w:val="6"/>
-        </w:numPr>
-      </w:pPr>
-      <w:r>
-        <w:rPr>
-          <w:b/>
-          <w:bCs/>
-        </w:rPr>
-        <w:t xml:space="preserve">React / </w:t>
-      </w:r>
-      <w:proofErr w:type="spellStart"/>
-      <w:r>
-        <w:rPr>
-          <w:b/>
-          <w:bCs/>
-        </w:rPr>
-        <w:t>Javascript</w:t>
-      </w:r>
-      <w:proofErr w:type="spellEnd"/>
-      <w:r>
-        <w:t>: アプリの動きを作るプログラミング言語。</w:t>
-      </w:r>
-    </w:p>
-    <w:p>
-      <w:pPr>
-        <w:numPr>
-          <w:ilvl w:val="0"/>
-          <w:numId w:val="6"/>
-        </w:numPr>
-      </w:pPr>
-      <w:r>
-        <w:rPr>
-          <w:b/>
-          <w:bCs/>
-        </w:rPr>
-        <w:t>Vite</w:t>
-      </w:r>
-      <w:r>
-        <w:t>: アプリを素早くビルド（組み立て）するためのツール。</w:t>
-      </w:r>
-    </w:p>
-    <w:p>
-      <w:pPr>
-        <w:numPr>
-          <w:ilvl w:val="0"/>
-          <w:numId w:val="6"/>
-        </w:numPr>
-      </w:pPr>
-      <w:proofErr w:type="spellStart"/>
-      <w:r>
-        <w:rPr>
-          <w:b/>
-          <w:bCs/>
-        </w:rPr>
-        <w:t>TailwindCSS</w:t>
-      </w:r>
-      <w:proofErr w:type="spellEnd"/>
-      <w:r>
-        <w:t>: 画面のデザイン（色、形、配置）を整えるためのツール。</w:t>
-      </w:r>
-    </w:p>
-    <w:p>
-      <w:pPr>
-        <w:numPr>
-          <w:ilvl w:val="0"/>
-          <w:numId w:val="6"/>
-        </w:numPr>
-      </w:pPr>
-      <w:r>
-        <w:rPr>
-          <w:b/>
-          <w:bCs/>
-        </w:rPr>
-        <w:t>Google Apps Script (GAS)</w:t>
-      </w:r>
-      <w:r>
-        <w:t>: Google スプレッドシートを強力なデータベースに変える魔法。</w:t>
-      </w:r>
-    </w:p>
-    <w:p>
-      <w:r>
-        <w:lastRenderedPageBreak/>
-        <w:pict w14:anchorId="6334F721">
-          <v:rect id="_x0000_i1080" style="width:532.8pt;height:.75pt" o:hrpct="0" o:hralign="center" o:hrstd="t" o:hr="t" fillcolor="#a0a0a0" stroked="f">
-            <v:textbox inset="5.85pt,.7pt,5.85pt,.7pt"/>
-          </v:rect>
-        </w:pict>
-      </w:r>
-    </w:p>
-    <w:p>
-      <w:r>
-        <w:t>NOTE</w:t>
-      </w:r>
-    </w:p>
-    <w:p>
-      <w:r>
-        <w:t>プログラミングができなくても、これら一つ一つのファイルが「連携」して動いているという全体像がわかれば、あなたは立派な「システムオーナー」です。</w:t>
+          <w:rFonts w:ascii="Segoe UI Emoji" w:hAnsi="Segoe UI Emoji" w:cs="Segoe UI Emoji"/>
+          <w:b/>
+          <w:bCs/>
+        </w:rPr>
+        <w:t>🌟</w:t>
+      </w:r>
+      <w:r>
+        <w:rPr>
+          <w:b/>
+          <w:bCs/>
+        </w:rPr>
+        <w:t xml:space="preserve"> まとめ：なぜ引っ越したのか？</w:t>
+      </w:r>
+    </w:p>
+    <w:p>
+      <w:r>
+        <w:t>**「災害時、みんなが一斉に報告を送っても、絶対に止まらず、一瞬で共有されるようにするため」**です。</w:t>
+      </w:r>
+    </w:p>
+    <w:p>
+      <w:r>
+        <w:t>Googleスプレッドシート（共有ノート）は事務作業には最高ですが、緊急時には弱点がありました。 現在の </w:t>
+      </w:r>
+      <w:r>
+        <w:rPr>
+          <w:b/>
+          <w:bCs/>
+        </w:rPr>
+        <w:t>Firebase ＋ Cloudflare</w:t>
+      </w:r>
+      <w:r>
+        <w:t> の組み合わせは、LINEやTwitterなどと同じように、**「数万人が同時に使ってもビクともしない、超リアルタイム</w:t>
+      </w:r>
+      <w:proofErr w:type="gramStart"/>
+      <w:r>
+        <w:t>な</w:t>
+      </w:r>
+      <w:proofErr w:type="gramEnd"/>
+      <w:r>
+        <w:t>システム」**となっています。</w:t>
+      </w:r>
+    </w:p>
+    <w:p>
+      <w:r>
+        <w:t>これで、消防団の皆様は「通信待ち」や「エラー」のストレスなく、現場の状況を確実に本部や仲間に届ける（LIVE配信する）ことができるようになりました！</w:t>
       </w:r>
     </w:p>
     <w:p/>
@@ -1647,6 +727,155 @@
     </w:lvl>
   </w:abstractNum>
   <w:abstractNum w:abstractNumId="1" w15:restartNumberingAfterBreak="0">
+    <w:nsid w:val="24A33355"/>
+    <w:multiLevelType w:val="multilevel"/>
+    <w:tmpl w:val="061228C0"/>
+    <w:lvl w:ilvl="0">
+      <w:start w:val="1"/>
+      <w:numFmt w:val="bullet"/>
+      <w:lvlText w:val=""/>
+      <w:lvlJc w:val="left"/>
+      <w:pPr>
+        <w:tabs>
+          <w:tab w:val="num" w:pos="720"/>
+        </w:tabs>
+        <w:ind w:left="720" w:hanging="360"/>
+      </w:pPr>
+      <w:rPr>
+        <w:rFonts w:ascii="Symbol" w:hAnsi="Symbol" w:hint="default"/>
+        <w:sz w:val="20"/>
+      </w:rPr>
+    </w:lvl>
+    <w:lvl w:ilvl="1" w:tentative="1">
+      <w:start w:val="1"/>
+      <w:numFmt w:val="bullet"/>
+      <w:lvlText w:val=""/>
+      <w:lvlJc w:val="left"/>
+      <w:pPr>
+        <w:tabs>
+          <w:tab w:val="num" w:pos="1440"/>
+        </w:tabs>
+        <w:ind w:left="1440" w:hanging="360"/>
+      </w:pPr>
+      <w:rPr>
+        <w:rFonts w:ascii="Symbol" w:hAnsi="Symbol" w:hint="default"/>
+        <w:sz w:val="20"/>
+      </w:rPr>
+    </w:lvl>
+    <w:lvl w:ilvl="2" w:tentative="1">
+      <w:start w:val="1"/>
+      <w:numFmt w:val="bullet"/>
+      <w:lvlText w:val=""/>
+      <w:lvlJc w:val="left"/>
+      <w:pPr>
+        <w:tabs>
+          <w:tab w:val="num" w:pos="2160"/>
+        </w:tabs>
+        <w:ind w:left="2160" w:hanging="360"/>
+      </w:pPr>
+      <w:rPr>
+        <w:rFonts w:ascii="Symbol" w:hAnsi="Symbol" w:hint="default"/>
+        <w:sz w:val="20"/>
+      </w:rPr>
+    </w:lvl>
+    <w:lvl w:ilvl="3" w:tentative="1">
+      <w:start w:val="1"/>
+      <w:numFmt w:val="bullet"/>
+      <w:lvlText w:val=""/>
+      <w:lvlJc w:val="left"/>
+      <w:pPr>
+        <w:tabs>
+          <w:tab w:val="num" w:pos="2880"/>
+        </w:tabs>
+        <w:ind w:left="2880" w:hanging="360"/>
+      </w:pPr>
+      <w:rPr>
+        <w:rFonts w:ascii="Symbol" w:hAnsi="Symbol" w:hint="default"/>
+        <w:sz w:val="20"/>
+      </w:rPr>
+    </w:lvl>
+    <w:lvl w:ilvl="4" w:tentative="1">
+      <w:start w:val="1"/>
+      <w:numFmt w:val="bullet"/>
+      <w:lvlText w:val=""/>
+      <w:lvlJc w:val="left"/>
+      <w:pPr>
+        <w:tabs>
+          <w:tab w:val="num" w:pos="3600"/>
+        </w:tabs>
+        <w:ind w:left="3600" w:hanging="360"/>
+      </w:pPr>
+      <w:rPr>
+        <w:rFonts w:ascii="Symbol" w:hAnsi="Symbol" w:hint="default"/>
+        <w:sz w:val="20"/>
+      </w:rPr>
+    </w:lvl>
+    <w:lvl w:ilvl="5" w:tentative="1">
+      <w:start w:val="1"/>
+      <w:numFmt w:val="bullet"/>
+      <w:lvlText w:val=""/>
+      <w:lvlJc w:val="left"/>
+      <w:pPr>
+        <w:tabs>
+          <w:tab w:val="num" w:pos="4320"/>
+        </w:tabs>
+        <w:ind w:left="4320" w:hanging="360"/>
+      </w:pPr>
+      <w:rPr>
+        <w:rFonts w:ascii="Symbol" w:hAnsi="Symbol" w:hint="default"/>
+        <w:sz w:val="20"/>
+      </w:rPr>
+    </w:lvl>
+    <w:lvl w:ilvl="6" w:tentative="1">
+      <w:start w:val="1"/>
+      <w:numFmt w:val="bullet"/>
+      <w:lvlText w:val=""/>
+      <w:lvlJc w:val="left"/>
+      <w:pPr>
+        <w:tabs>
+          <w:tab w:val="num" w:pos="5040"/>
+        </w:tabs>
+        <w:ind w:left="5040" w:hanging="360"/>
+      </w:pPr>
+      <w:rPr>
+        <w:rFonts w:ascii="Symbol" w:hAnsi="Symbol" w:hint="default"/>
+        <w:sz w:val="20"/>
+      </w:rPr>
+    </w:lvl>
+    <w:lvl w:ilvl="7" w:tentative="1">
+      <w:start w:val="1"/>
+      <w:numFmt w:val="bullet"/>
+      <w:lvlText w:val=""/>
+      <w:lvlJc w:val="left"/>
+      <w:pPr>
+        <w:tabs>
+          <w:tab w:val="num" w:pos="5760"/>
+        </w:tabs>
+        <w:ind w:left="5760" w:hanging="360"/>
+      </w:pPr>
+      <w:rPr>
+        <w:rFonts w:ascii="Symbol" w:hAnsi="Symbol" w:hint="default"/>
+        <w:sz w:val="20"/>
+      </w:rPr>
+    </w:lvl>
+    <w:lvl w:ilvl="8" w:tentative="1">
+      <w:start w:val="1"/>
+      <w:numFmt w:val="bullet"/>
+      <w:lvlText w:val=""/>
+      <w:lvlJc w:val="left"/>
+      <w:pPr>
+        <w:tabs>
+          <w:tab w:val="num" w:pos="6480"/>
+        </w:tabs>
+        <w:ind w:left="6480" w:hanging="360"/>
+      </w:pPr>
+      <w:rPr>
+        <w:rFonts w:ascii="Symbol" w:hAnsi="Symbol" w:hint="default"/>
+        <w:sz w:val="20"/>
+      </w:rPr>
+    </w:lvl>
+  </w:abstractNum>
+  <w:abstractNum w:abstractNumId="2" w15:restartNumberingAfterBreak="0">
     <w:nsid w:val="27C02E01"/>
     <w:multiLevelType w:val="multilevel"/>
     <w:tmpl w:val="2FA8ACF0"/>
@@ -1763,7 +992,273 @@
       </w:pPr>
     </w:lvl>
   </w:abstractNum>
-  <w:abstractNum w:abstractNumId="2" w15:restartNumberingAfterBreak="0">
+  <w:abstractNum w:abstractNumId="3" w15:restartNumberingAfterBreak="0">
+    <w:nsid w:val="28AD2384"/>
+    <w:multiLevelType w:val="multilevel"/>
+    <w:tmpl w:val="8EF252A8"/>
+    <w:lvl w:ilvl="0">
+      <w:start w:val="1"/>
+      <w:numFmt w:val="decimal"/>
+      <w:lvlText w:val="%1."/>
+      <w:lvlJc w:val="left"/>
+      <w:pPr>
+        <w:tabs>
+          <w:tab w:val="num" w:pos="720"/>
+        </w:tabs>
+        <w:ind w:left="720" w:hanging="360"/>
+      </w:pPr>
+    </w:lvl>
+    <w:lvl w:ilvl="1">
+      <w:start w:val="1"/>
+      <w:numFmt w:val="bullet"/>
+      <w:lvlText w:val=""/>
+      <w:lvlJc w:val="left"/>
+      <w:pPr>
+        <w:tabs>
+          <w:tab w:val="num" w:pos="1440"/>
+        </w:tabs>
+        <w:ind w:left="1440" w:hanging="360"/>
+      </w:pPr>
+      <w:rPr>
+        <w:rFonts w:ascii="Symbol" w:hAnsi="Symbol" w:hint="default"/>
+        <w:sz w:val="20"/>
+      </w:rPr>
+    </w:lvl>
+    <w:lvl w:ilvl="2" w:tentative="1">
+      <w:start w:val="1"/>
+      <w:numFmt w:val="decimal"/>
+      <w:lvlText w:val="%3."/>
+      <w:lvlJc w:val="left"/>
+      <w:pPr>
+        <w:tabs>
+          <w:tab w:val="num" w:pos="2160"/>
+        </w:tabs>
+        <w:ind w:left="2160" w:hanging="360"/>
+      </w:pPr>
+    </w:lvl>
+    <w:lvl w:ilvl="3" w:tentative="1">
+      <w:start w:val="1"/>
+      <w:numFmt w:val="decimal"/>
+      <w:lvlText w:val="%4."/>
+      <w:lvlJc w:val="left"/>
+      <w:pPr>
+        <w:tabs>
+          <w:tab w:val="num" w:pos="2880"/>
+        </w:tabs>
+        <w:ind w:left="2880" w:hanging="360"/>
+      </w:pPr>
+    </w:lvl>
+    <w:lvl w:ilvl="4" w:tentative="1">
+      <w:start w:val="1"/>
+      <w:numFmt w:val="decimal"/>
+      <w:lvlText w:val="%5."/>
+      <w:lvlJc w:val="left"/>
+      <w:pPr>
+        <w:tabs>
+          <w:tab w:val="num" w:pos="3600"/>
+        </w:tabs>
+        <w:ind w:left="3600" w:hanging="360"/>
+      </w:pPr>
+    </w:lvl>
+    <w:lvl w:ilvl="5" w:tentative="1">
+      <w:start w:val="1"/>
+      <w:numFmt w:val="decimal"/>
+      <w:lvlText w:val="%6."/>
+      <w:lvlJc w:val="left"/>
+      <w:pPr>
+        <w:tabs>
+          <w:tab w:val="num" w:pos="4320"/>
+        </w:tabs>
+        <w:ind w:left="4320" w:hanging="360"/>
+      </w:pPr>
+    </w:lvl>
+    <w:lvl w:ilvl="6" w:tentative="1">
+      <w:start w:val="1"/>
+      <w:numFmt w:val="decimal"/>
+      <w:lvlText w:val="%7."/>
+      <w:lvlJc w:val="left"/>
+      <w:pPr>
+        <w:tabs>
+          <w:tab w:val="num" w:pos="5040"/>
+        </w:tabs>
+        <w:ind w:left="5040" w:hanging="360"/>
+      </w:pPr>
+    </w:lvl>
+    <w:lvl w:ilvl="7" w:tentative="1">
+      <w:start w:val="1"/>
+      <w:numFmt w:val="decimal"/>
+      <w:lvlText w:val="%8."/>
+      <w:lvlJc w:val="left"/>
+      <w:pPr>
+        <w:tabs>
+          <w:tab w:val="num" w:pos="5760"/>
+        </w:tabs>
+        <w:ind w:left="5760" w:hanging="360"/>
+      </w:pPr>
+    </w:lvl>
+    <w:lvl w:ilvl="8" w:tentative="1">
+      <w:start w:val="1"/>
+      <w:numFmt w:val="decimal"/>
+      <w:lvlText w:val="%9."/>
+      <w:lvlJc w:val="left"/>
+      <w:pPr>
+        <w:tabs>
+          <w:tab w:val="num" w:pos="6480"/>
+        </w:tabs>
+        <w:ind w:left="6480" w:hanging="360"/>
+      </w:pPr>
+    </w:lvl>
+  </w:abstractNum>
+  <w:abstractNum w:abstractNumId="4" w15:restartNumberingAfterBreak="0">
+    <w:nsid w:val="2B8434CE"/>
+    <w:multiLevelType w:val="multilevel"/>
+    <w:tmpl w:val="E904E99C"/>
+    <w:lvl w:ilvl="0">
+      <w:start w:val="1"/>
+      <w:numFmt w:val="bullet"/>
+      <w:lvlText w:val=""/>
+      <w:lvlJc w:val="left"/>
+      <w:pPr>
+        <w:tabs>
+          <w:tab w:val="num" w:pos="720"/>
+        </w:tabs>
+        <w:ind w:left="720" w:hanging="360"/>
+      </w:pPr>
+      <w:rPr>
+        <w:rFonts w:ascii="Symbol" w:hAnsi="Symbol" w:hint="default"/>
+        <w:sz w:val="20"/>
+      </w:rPr>
+    </w:lvl>
+    <w:lvl w:ilvl="1">
+      <w:start w:val="1"/>
+      <w:numFmt w:val="bullet"/>
+      <w:lvlText w:val=""/>
+      <w:lvlJc w:val="left"/>
+      <w:pPr>
+        <w:tabs>
+          <w:tab w:val="num" w:pos="1440"/>
+        </w:tabs>
+        <w:ind w:left="1440" w:hanging="360"/>
+      </w:pPr>
+      <w:rPr>
+        <w:rFonts w:ascii="Symbol" w:hAnsi="Symbol" w:hint="default"/>
+        <w:sz w:val="20"/>
+      </w:rPr>
+    </w:lvl>
+    <w:lvl w:ilvl="2" w:tentative="1">
+      <w:start w:val="1"/>
+      <w:numFmt w:val="bullet"/>
+      <w:lvlText w:val=""/>
+      <w:lvlJc w:val="left"/>
+      <w:pPr>
+        <w:tabs>
+          <w:tab w:val="num" w:pos="2160"/>
+        </w:tabs>
+        <w:ind w:left="2160" w:hanging="360"/>
+      </w:pPr>
+      <w:rPr>
+        <w:rFonts w:ascii="Symbol" w:hAnsi="Symbol" w:hint="default"/>
+        <w:sz w:val="20"/>
+      </w:rPr>
+    </w:lvl>
+    <w:lvl w:ilvl="3" w:tentative="1">
+      <w:start w:val="1"/>
+      <w:numFmt w:val="bullet"/>
+      <w:lvlText w:val=""/>
+      <w:lvlJc w:val="left"/>
+      <w:pPr>
+        <w:tabs>
+          <w:tab w:val="num" w:pos="2880"/>
+        </w:tabs>
+        <w:ind w:left="2880" w:hanging="360"/>
+      </w:pPr>
+      <w:rPr>
+        <w:rFonts w:ascii="Symbol" w:hAnsi="Symbol" w:hint="default"/>
+        <w:sz w:val="20"/>
+      </w:rPr>
+    </w:lvl>
+    <w:lvl w:ilvl="4" w:tentative="1">
+      <w:start w:val="1"/>
+      <w:numFmt w:val="bullet"/>
+      <w:lvlText w:val=""/>
+      <w:lvlJc w:val="left"/>
+      <w:pPr>
+        <w:tabs>
+          <w:tab w:val="num" w:pos="3600"/>
+        </w:tabs>
+        <w:ind w:left="3600" w:hanging="360"/>
+      </w:pPr>
+      <w:rPr>
+        <w:rFonts w:ascii="Symbol" w:hAnsi="Symbol" w:hint="default"/>
+        <w:sz w:val="20"/>
+      </w:rPr>
+    </w:lvl>
+    <w:lvl w:ilvl="5" w:tentative="1">
+      <w:start w:val="1"/>
+      <w:numFmt w:val="bullet"/>
+      <w:lvlText w:val=""/>
+      <w:lvlJc w:val="left"/>
+      <w:pPr>
+        <w:tabs>
+          <w:tab w:val="num" w:pos="4320"/>
+        </w:tabs>
+        <w:ind w:left="4320" w:hanging="360"/>
+      </w:pPr>
+      <w:rPr>
+        <w:rFonts w:ascii="Symbol" w:hAnsi="Symbol" w:hint="default"/>
+        <w:sz w:val="20"/>
+      </w:rPr>
+    </w:lvl>
+    <w:lvl w:ilvl="6" w:tentative="1">
+      <w:start w:val="1"/>
+      <w:numFmt w:val="bullet"/>
+      <w:lvlText w:val=""/>
+      <w:lvlJc w:val="left"/>
+      <w:pPr>
+        <w:tabs>
+          <w:tab w:val="num" w:pos="5040"/>
+        </w:tabs>
+        <w:ind w:left="5040" w:hanging="360"/>
+      </w:pPr>
+      <w:rPr>
+        <w:rFonts w:ascii="Symbol" w:hAnsi="Symbol" w:hint="default"/>
+        <w:sz w:val="20"/>
+      </w:rPr>
+    </w:lvl>
+    <w:lvl w:ilvl="7" w:tentative="1">
+      <w:start w:val="1"/>
+      <w:numFmt w:val="bullet"/>
+      <w:lvlText w:val=""/>
+      <w:lvlJc w:val="left"/>
+      <w:pPr>
+        <w:tabs>
+          <w:tab w:val="num" w:pos="5760"/>
+        </w:tabs>
+        <w:ind w:left="5760" w:hanging="360"/>
+      </w:pPr>
+      <w:rPr>
+        <w:rFonts w:ascii="Symbol" w:hAnsi="Symbol" w:hint="default"/>
+        <w:sz w:val="20"/>
+      </w:rPr>
+    </w:lvl>
+    <w:lvl w:ilvl="8" w:tentative="1">
+      <w:start w:val="1"/>
+      <w:numFmt w:val="bullet"/>
+      <w:lvlText w:val=""/>
+      <w:lvlJc w:val="left"/>
+      <w:pPr>
+        <w:tabs>
+          <w:tab w:val="num" w:pos="6480"/>
+        </w:tabs>
+        <w:ind w:left="6480" w:hanging="360"/>
+      </w:pPr>
+      <w:rPr>
+        <w:rFonts w:ascii="Symbol" w:hAnsi="Symbol" w:hint="default"/>
+        <w:sz w:val="20"/>
+      </w:rPr>
+    </w:lvl>
+  </w:abstractNum>
+  <w:abstractNum w:abstractNumId="5" w15:restartNumberingAfterBreak="0">
     <w:nsid w:val="2E2B5604"/>
     <w:multiLevelType w:val="multilevel"/>
     <w:tmpl w:val="2492726A"/>
@@ -1912,7 +1407,7 @@
       </w:rPr>
     </w:lvl>
   </w:abstractNum>
-  <w:abstractNum w:abstractNumId="3" w15:restartNumberingAfterBreak="0">
+  <w:abstractNum w:abstractNumId="6" w15:restartNumberingAfterBreak="0">
     <w:nsid w:val="569C5E91"/>
     <w:multiLevelType w:val="multilevel"/>
     <w:tmpl w:val="3552FB0E"/>
@@ -2025,7 +1520,156 @@
       </w:pPr>
     </w:lvl>
   </w:abstractNum>
-  <w:abstractNum w:abstractNumId="4" w15:restartNumberingAfterBreak="0">
+  <w:abstractNum w:abstractNumId="7" w15:restartNumberingAfterBreak="0">
+    <w:nsid w:val="609E6854"/>
+    <w:multiLevelType w:val="multilevel"/>
+    <w:tmpl w:val="78749C96"/>
+    <w:lvl w:ilvl="0">
+      <w:start w:val="1"/>
+      <w:numFmt w:val="bullet"/>
+      <w:lvlText w:val=""/>
+      <w:lvlJc w:val="left"/>
+      <w:pPr>
+        <w:tabs>
+          <w:tab w:val="num" w:pos="720"/>
+        </w:tabs>
+        <w:ind w:left="720" w:hanging="360"/>
+      </w:pPr>
+      <w:rPr>
+        <w:rFonts w:ascii="Symbol" w:hAnsi="Symbol" w:hint="default"/>
+        <w:sz w:val="20"/>
+      </w:rPr>
+    </w:lvl>
+    <w:lvl w:ilvl="1" w:tentative="1">
+      <w:start w:val="1"/>
+      <w:numFmt w:val="bullet"/>
+      <w:lvlText w:val=""/>
+      <w:lvlJc w:val="left"/>
+      <w:pPr>
+        <w:tabs>
+          <w:tab w:val="num" w:pos="1440"/>
+        </w:tabs>
+        <w:ind w:left="1440" w:hanging="360"/>
+      </w:pPr>
+      <w:rPr>
+        <w:rFonts w:ascii="Symbol" w:hAnsi="Symbol" w:hint="default"/>
+        <w:sz w:val="20"/>
+      </w:rPr>
+    </w:lvl>
+    <w:lvl w:ilvl="2" w:tentative="1">
+      <w:start w:val="1"/>
+      <w:numFmt w:val="bullet"/>
+      <w:lvlText w:val=""/>
+      <w:lvlJc w:val="left"/>
+      <w:pPr>
+        <w:tabs>
+          <w:tab w:val="num" w:pos="2160"/>
+        </w:tabs>
+        <w:ind w:left="2160" w:hanging="360"/>
+      </w:pPr>
+      <w:rPr>
+        <w:rFonts w:ascii="Symbol" w:hAnsi="Symbol" w:hint="default"/>
+        <w:sz w:val="20"/>
+      </w:rPr>
+    </w:lvl>
+    <w:lvl w:ilvl="3" w:tentative="1">
+      <w:start w:val="1"/>
+      <w:numFmt w:val="bullet"/>
+      <w:lvlText w:val=""/>
+      <w:lvlJc w:val="left"/>
+      <w:pPr>
+        <w:tabs>
+          <w:tab w:val="num" w:pos="2880"/>
+        </w:tabs>
+        <w:ind w:left="2880" w:hanging="360"/>
+      </w:pPr>
+      <w:rPr>
+        <w:rFonts w:ascii="Symbol" w:hAnsi="Symbol" w:hint="default"/>
+        <w:sz w:val="20"/>
+      </w:rPr>
+    </w:lvl>
+    <w:lvl w:ilvl="4" w:tentative="1">
+      <w:start w:val="1"/>
+      <w:numFmt w:val="bullet"/>
+      <w:lvlText w:val=""/>
+      <w:lvlJc w:val="left"/>
+      <w:pPr>
+        <w:tabs>
+          <w:tab w:val="num" w:pos="3600"/>
+        </w:tabs>
+        <w:ind w:left="3600" w:hanging="360"/>
+      </w:pPr>
+      <w:rPr>
+        <w:rFonts w:ascii="Symbol" w:hAnsi="Symbol" w:hint="default"/>
+        <w:sz w:val="20"/>
+      </w:rPr>
+    </w:lvl>
+    <w:lvl w:ilvl="5" w:tentative="1">
+      <w:start w:val="1"/>
+      <w:numFmt w:val="bullet"/>
+      <w:lvlText w:val=""/>
+      <w:lvlJc w:val="left"/>
+      <w:pPr>
+        <w:tabs>
+          <w:tab w:val="num" w:pos="4320"/>
+        </w:tabs>
+        <w:ind w:left="4320" w:hanging="360"/>
+      </w:pPr>
+      <w:rPr>
+        <w:rFonts w:ascii="Symbol" w:hAnsi="Symbol" w:hint="default"/>
+        <w:sz w:val="20"/>
+      </w:rPr>
+    </w:lvl>
+    <w:lvl w:ilvl="6" w:tentative="1">
+      <w:start w:val="1"/>
+      <w:numFmt w:val="bullet"/>
+      <w:lvlText w:val=""/>
+      <w:lvlJc w:val="left"/>
+      <w:pPr>
+        <w:tabs>
+          <w:tab w:val="num" w:pos="5040"/>
+        </w:tabs>
+        <w:ind w:left="5040" w:hanging="360"/>
+      </w:pPr>
+      <w:rPr>
+        <w:rFonts w:ascii="Symbol" w:hAnsi="Symbol" w:hint="default"/>
+        <w:sz w:val="20"/>
+      </w:rPr>
+    </w:lvl>
+    <w:lvl w:ilvl="7" w:tentative="1">
+      <w:start w:val="1"/>
+      <w:numFmt w:val="bullet"/>
+      <w:lvlText w:val=""/>
+      <w:lvlJc w:val="left"/>
+      <w:pPr>
+        <w:tabs>
+          <w:tab w:val="num" w:pos="5760"/>
+        </w:tabs>
+        <w:ind w:left="5760" w:hanging="360"/>
+      </w:pPr>
+      <w:rPr>
+        <w:rFonts w:ascii="Symbol" w:hAnsi="Symbol" w:hint="default"/>
+        <w:sz w:val="20"/>
+      </w:rPr>
+    </w:lvl>
+    <w:lvl w:ilvl="8" w:tentative="1">
+      <w:start w:val="1"/>
+      <w:numFmt w:val="bullet"/>
+      <w:lvlText w:val=""/>
+      <w:lvlJc w:val="left"/>
+      <w:pPr>
+        <w:tabs>
+          <w:tab w:val="num" w:pos="6480"/>
+        </w:tabs>
+        <w:ind w:left="6480" w:hanging="360"/>
+      </w:pPr>
+      <w:rPr>
+        <w:rFonts w:ascii="Symbol" w:hAnsi="Symbol" w:hint="default"/>
+        <w:sz w:val="20"/>
+      </w:rPr>
+    </w:lvl>
+  </w:abstractNum>
+  <w:abstractNum w:abstractNumId="8" w15:restartNumberingAfterBreak="0">
     <w:nsid w:val="6D121C65"/>
     <w:multiLevelType w:val="multilevel"/>
     <w:tmpl w:val="EE6EB00E"/>
@@ -2170,7 +1814,7 @@
       </w:rPr>
     </w:lvl>
   </w:abstractNum>
-  <w:abstractNum w:abstractNumId="5" w15:restartNumberingAfterBreak="0">
+  <w:abstractNum w:abstractNumId="9" w15:restartNumberingAfterBreak="0">
     <w:nsid w:val="7D8A5A12"/>
     <w:multiLevelType w:val="multilevel"/>
     <w:tmpl w:val="7B366138"/>
@@ -2316,22 +1960,34 @@
     </w:lvl>
   </w:abstractNum>
   <w:num w:numId="1" w16cid:durableId="283535646">
-    <w:abstractNumId w:val="1"/>
+    <w:abstractNumId w:val="2"/>
   </w:num>
   <w:num w:numId="2" w16cid:durableId="1939604651">
-    <w:abstractNumId w:val="2"/>
+    <w:abstractNumId w:val="5"/>
   </w:num>
   <w:num w:numId="3" w16cid:durableId="1957827494">
-    <w:abstractNumId w:val="3"/>
+    <w:abstractNumId w:val="6"/>
   </w:num>
   <w:num w:numId="4" w16cid:durableId="271403952">
-    <w:abstractNumId w:val="5"/>
+    <w:abstractNumId w:val="9"/>
   </w:num>
   <w:num w:numId="5" w16cid:durableId="1235168081">
-    <w:abstractNumId w:val="4"/>
+    <w:abstractNumId w:val="8"/>
   </w:num>
   <w:num w:numId="6" w16cid:durableId="900868683">
     <w:abstractNumId w:val="0"/>
+  </w:num>
+  <w:num w:numId="7" w16cid:durableId="638077210">
+    <w:abstractNumId w:val="3"/>
+  </w:num>
+  <w:num w:numId="8" w16cid:durableId="1702047825">
+    <w:abstractNumId w:val="4"/>
+  </w:num>
+  <w:num w:numId="9" w16cid:durableId="1221092526">
+    <w:abstractNumId w:val="7"/>
+  </w:num>
+  <w:num w:numId="10" w16cid:durableId="1560171088">
+    <w:abstractNumId w:val="1"/>
   </w:num>
 </w:numbering>
 </file>

</xml_diff>